<commit_message>
docs(guia-lider): use neutral/Chilean Spanish (tú instead of vos)
</commit_message>
<xml_diff>
--- a/docs/Guia_Lider_TPT.docx
+++ b/docs/Guia_Lider_TPT.docx
@@ -274,7 +274,7 @@
           <w:color w:val="2D3748"/>
           <w:sz w:val="22"/>
         </w:rPr>
-        <w:t>Todos los líderes reciben un correo de bienvenida con sus credenciales cuando el administrador carga los datos del programa. Si todavía no lo recibiste, revisá tu carpeta de spam o contactá al administrador del programa.</w:t>
+        <w:t>Todos los líderes reciben un correo de bienvenida con sus credenciales cuando el administrador carga los datos del programa. Si todavía no lo recibes, revisa tu carpeta de spam o contacta al administrador del programa.</w:t>
       </w:r>
     </w:p>
     <w:p>
@@ -333,7 +333,7 @@
                 <w:color w:val="2D3748"/>
                 <w:sz w:val="22"/>
               </w:rPr>
-              <w:t>Abrí un navegador (Chrome, Edge, Firefox o Safari) e ingresá a: https://plataforma.msochile.cl</w:t>
+              <w:t>Abre un navegador (Chrome, Edge, Firefox o Safari) e ingresa a: https://plataforma.msochile.cl</w:t>
             </w:r>
           </w:p>
         </w:tc>
@@ -382,7 +382,7 @@
                 <w:color w:val="2D3748"/>
                 <w:sz w:val="22"/>
               </w:rPr>
-              <w:t>Ingresá tu email corporativo en el campo correspondiente.</w:t>
+              <w:t>Ingresa tu email corporativo en el campo correspondiente.</w:t>
             </w:r>
           </w:p>
         </w:tc>
@@ -431,7 +431,7 @@
                 <w:color w:val="2D3748"/>
                 <w:sz w:val="22"/>
               </w:rPr>
-              <w:t>Ingresá tu contraseña. Si es tu primer acceso, usá la contraseña que recibiste por correo.</w:t>
+              <w:t>Ingresa tu contraseña. Si es tu primer acceso, usa la contraseña que recibiste por correo.</w:t>
             </w:r>
           </w:p>
         </w:tc>
@@ -480,7 +480,7 @@
                 <w:color w:val="2D3748"/>
                 <w:sz w:val="22"/>
               </w:rPr>
-              <w:t>Click en el botón "Ingresar".</w:t>
+              <w:t>Haz click en el botón "Ingresar".</w:t>
             </w:r>
           </w:p>
         </w:tc>
@@ -548,7 +548,7 @@
           <w:color w:val="2D3748"/>
           <w:sz w:val="22"/>
         </w:rPr>
-        <w:t>Si no recordás tu contraseña, seguí estos pasos:</w:t>
+        <w:t>Si no recuerdas tu contraseña, sigue estos pasos:</w:t>
       </w:r>
     </w:p>
     <w:tbl>
@@ -593,7 +593,7 @@
                 <w:color w:val="2D3748"/>
                 <w:sz w:val="22"/>
               </w:rPr>
-              <w:t>En la pantalla de login, click en "¿Olvidaste tu contraseña?"</w:t>
+              <w:t>En la pantalla de login, haz click en "¿Olvidaste tu contraseña?"</w:t>
             </w:r>
           </w:p>
         </w:tc>
@@ -642,7 +642,7 @@
                 <w:color w:val="2D3748"/>
                 <w:sz w:val="22"/>
               </w:rPr>
-              <w:t>Ingresá tu email corporativo y click en "Enviar instrucciones".</w:t>
+              <w:t>Ingresa tu email corporativo y haz click en "Enviar instrucciones".</w:t>
             </w:r>
           </w:p>
         </w:tc>
@@ -740,7 +740,7 @@
                 <w:color w:val="2D3748"/>
                 <w:sz w:val="22"/>
               </w:rPr>
-              <w:t>El link te lleva a una pantalla donde podés definir tu nueva contraseña. Elegí una combinación segura de al menos 6 caracteres.</w:t>
+              <w:t>El link te lleva a una pantalla donde puedes definir tu nueva contraseña. Elige una combinación segura de al menos 6 caracteres.</w:t>
             </w:r>
           </w:p>
         </w:tc>
@@ -779,7 +779,7 @@
                 <w:color w:val="2D3748"/>
                 <w:sz w:val="21"/>
               </w:rPr>
-              <w:t>El link de recuperación expira en 1 hora y solo puede usarse una vez por motivos de seguridad. Si no lo usás a tiempo, solicitá otro.</w:t>
+              <w:t>El link de recuperación expira en 1 hora y solo puede usarse una vez por motivos de seguridad. Si no lo usas a tiempo, solicita otro.</w:t>
             </w:r>
           </w:p>
         </w:tc>
@@ -997,7 +997,7 @@
                 <w:color w:val="2D3748"/>
                 <w:sz w:val="22"/>
               </w:rPr>
-              <w:t>En el menú lateral, click en "Mis Evaluaciones".</w:t>
+              <w:t>En el menú lateral, haz click en "Mis Evaluaciones".</w:t>
             </w:r>
           </w:p>
         </w:tc>
@@ -1095,7 +1095,7 @@
                 <w:color w:val="2D3748"/>
                 <w:sz w:val="22"/>
               </w:rPr>
-              <w:t>En una encuesta pendiente, click en "Responder".</w:t>
+              <w:t>En una encuesta pendiente, haz click en "Responder".</w:t>
             </w:r>
           </w:p>
         </w:tc>
@@ -1144,7 +1144,7 @@
                 <w:color w:val="2D3748"/>
                 <w:sz w:val="22"/>
               </w:rPr>
-              <w:t>Leé las instrucciones y respondé cada pregunta. La mayoría son de tipo escala de niveles (1 a 4).</w:t>
+              <w:t>Lee las instrucciones y responde cada pregunta. La mayoría son de tipo escala de niveles (1 a 4).</w:t>
             </w:r>
           </w:p>
         </w:tc>
@@ -1259,7 +1259,7 @@
                 <w:color w:val="2D3748"/>
                 <w:sz w:val="22"/>
               </w:rPr>
-              <w:t>Una barra de progreso te indica cuántas preguntas llevás respondidas.</w:t>
+              <w:t>Una barra de progreso te indica cuántas preguntas llevas respondidas.</w:t>
             </w:r>
           </w:p>
         </w:tc>
@@ -1308,7 +1308,7 @@
                 <w:color w:val="2D3748"/>
                 <w:sz w:val="22"/>
               </w:rPr>
-              <w:t>Al terminar, click en "Enviar Respuestas". Recibirás un correo de confirmación.</w:t>
+              <w:t>Al terminar, haz click en "Enviar Respuestas". Recibirás un correo de confirmación.</w:t>
             </w:r>
           </w:p>
         </w:tc>
@@ -1361,7 +1361,7 @@
                 <w:color w:val="2D3748"/>
                 <w:sz w:val="21"/>
               </w:rPr>
-              <w:t>Si ya enviaste una evaluación y necesitas corregirla, ve a Mis Evaluaciones → Encuestas Completadas y click en "Rehacer evaluación". Tus respuestas anteriores serán reemplazadas por las nuevas.</w:t>
+              <w:t>Si ya enviaste una evaluación y necesitas corregirla, ve a Mis Evaluaciones → Encuestas Completadas y haz click en "Rehacer evaluación". Tus respuestas anteriores serán reemplazadas por las nuevas.</w:t>
             </w:r>
           </w:p>
         </w:tc>
@@ -1390,7 +1390,7 @@
           <w:color w:val="2D3748"/>
           <w:sz w:val="22"/>
         </w:rPr>
-        <w:t>Durante el programa vas a responder cuatro tipos de evaluaciones distribuidas en dos momentos: inicial y final.</w:t>
+        <w:t>Durante el programa responderás cuatro tipos de evaluaciones distribuidas en dos momentos: inicial y final.</w:t>
       </w:r>
     </w:p>
     <w:tbl>
@@ -1774,7 +1774,7 @@
           <w:color w:val="2D3748"/>
           <w:sz w:val="22"/>
         </w:rPr>
-        <w:t>Como líder, tenés un colaborador asignado que participará contigo durante el programa. Es tu "par de desarrollo" para los ejercicios de coevaluación y feedback.</w:t>
+        <w:t>Como líder, tienes un colaborador asignado que participará contigo durante el programa. Es tu "par de desarrollo" para los ejercicios de coevaluación y feedback.</w:t>
       </w:r>
     </w:p>
     <w:p>
@@ -1833,7 +1833,7 @@
                 <w:color w:val="2D3748"/>
                 <w:sz w:val="22"/>
               </w:rPr>
-              <w:t>En el menú lateral, click en "Mi Equipo".</w:t>
+              <w:t>En el menú lateral, haz click en "Mi Equipo".</w:t>
             </w:r>
           </w:p>
         </w:tc>
@@ -1921,7 +1921,7 @@
                 <w:color w:val="2D3748"/>
                 <w:sz w:val="21"/>
               </w:rPr>
-              <w:t>Si no ves ningún colaborador asignado, contactá al administrador del programa.</w:t>
+              <w:t>Si no ves ningún colaborador asignado, contacta al administrador del programa.</w:t>
             </w:r>
           </w:p>
         </w:tc>
@@ -2058,7 +2058,7 @@
                 <w:color w:val="2D3748"/>
                 <w:sz w:val="22"/>
               </w:rPr>
-              <w:t>En la tarjeta de tu colaborador, click en "Dar Feedback".</w:t>
+              <w:t>En la tarjeta de tu colaborador, haz click en "Dar Feedback".</w:t>
             </w:r>
           </w:p>
         </w:tc>
@@ -2107,7 +2107,7 @@
                 <w:color w:val="2D3748"/>
                 <w:sz w:val="22"/>
               </w:rPr>
-              <w:t>Completá los tres campos obligatorios: Fortaleza observada, Aspecto a reforzar y Recomendación.</w:t>
+              <w:t>Completa los tres campos obligatorios: Fortaleza observada, Aspecto a reforzar y Recomendación.</w:t>
             </w:r>
           </w:p>
         </w:tc>
@@ -2156,7 +2156,7 @@
                 <w:color w:val="2D3748"/>
                 <w:sz w:val="22"/>
               </w:rPr>
-              <w:t>Click en "Enviar Feedback". Podrás ver el histórico de feedback entregado en la misma vista.</w:t>
+              <w:t>Haz click en "Enviar Feedback". Podrás ver el histórico de feedback entregado en la misma vista.</w:t>
             </w:r>
           </w:p>
         </w:tc>
@@ -2187,7 +2187,7 @@
           <w:color w:val="2D3748"/>
           <w:sz w:val="22"/>
         </w:rPr>
-        <w:t>Sé específico: mencioná una situación concreta, no generalidades.</w:t>
+        <w:t>Sé específico: menciona una situación concreta, no generalidades.</w:t>
       </w:r>
     </w:p>
     <w:p>
@@ -2200,7 +2200,7 @@
           <w:color w:val="2D3748"/>
           <w:sz w:val="22"/>
         </w:rPr>
-        <w:t>Enfocá en el comportamiento observado, no en la persona.</w:t>
+        <w:t>Enfócate en el comportamiento observado, no en la persona.</w:t>
       </w:r>
     </w:p>
     <w:p>
@@ -2213,7 +2213,7 @@
           <w:color w:val="2D3748"/>
           <w:sz w:val="22"/>
         </w:rPr>
-        <w:t>Ofrecé recomendaciones accionables.</w:t>
+        <w:t>Ofrece recomendaciones accionables.</w:t>
       </w:r>
     </w:p>
     <w:p>
@@ -2226,7 +2226,7 @@
           <w:color w:val="2D3748"/>
           <w:sz w:val="22"/>
         </w:rPr>
-        <w:t>Mantené un tono constructivo y respetuoso.</w:t>
+        <w:t>Mantén un tono constructivo y respetuoso.</w:t>
       </w:r>
     </w:p>
     <w:p>
@@ -2345,7 +2345,7 @@
                 <w:color w:val="2D3748"/>
                 <w:sz w:val="22"/>
               </w:rPr>
-              <w:t>Verás una lista de todos los archivos disponibles. Click en cada uno para descargarlo o visualizarlo.</w:t>
+              <w:t>Verás una lista de todos los archivos disponibles. Haz click en cada uno para descargarlo o visualizarlo.</w:t>
             </w:r>
           </w:p>
         </w:tc>
@@ -2735,7 +2735,7 @@
                 <w:color w:val="2D3748"/>
                 <w:sz w:val="21"/>
               </w:rPr>
-              <w:t>Estos informes son generados por el administrador. Si querés acceder al tuyo, contactá al administrador del programa.</w:t>
+              <w:t>Estos informes son generados por el administrador. Si quieres acceder al tuyo, contacta al administrador del programa.</w:t>
             </w:r>
           </w:p>
         </w:tc>
@@ -2764,7 +2764,7 @@
           <w:color w:val="2D3748"/>
           <w:sz w:val="22"/>
         </w:rPr>
-        <w:t>Si encontrás algún error técnico, tenés una duda o querés sugerir una mejora, podés reportarlo directamente desde la plataforma.</w:t>
+        <w:t>Si encuentras algún error técnico, tienes una duda o quieres sugerir una mejora, puedes reportarlo directamente desde la plataforma.</w:t>
       </w:r>
     </w:p>
     <w:tbl>
@@ -2809,7 +2809,7 @@
                 <w:color w:val="2D3748"/>
                 <w:sz w:val="22"/>
               </w:rPr>
-              <w:t>En el menú lateral, click en "Incidencias".</w:t>
+              <w:t>En el menú lateral, haz click en "Incidencias".</w:t>
             </w:r>
           </w:p>
         </w:tc>
@@ -2858,7 +2858,7 @@
                 <w:color w:val="2D3748"/>
                 <w:sz w:val="22"/>
               </w:rPr>
-              <w:t>Completá los campos: categoría, título, descripción del problema y, opcionalmente, adjuntá una captura de pantalla.</w:t>
+              <w:t>Completa los campos: categoría, título, descripción del problema y, opcionalmente, adjunta una captura de pantalla.</w:t>
             </w:r>
           </w:p>
         </w:tc>
@@ -2907,7 +2907,7 @@
                 <w:color w:val="2D3748"/>
                 <w:sz w:val="22"/>
               </w:rPr>
-              <w:t>Click en "Reportar". El equipo de soporte recibirá tu reporte y te contactará.</w:t>
+              <w:t>Haz click en "Reportar". El equipo de soporte recibirá tu reporte y te contactará.</w:t>
             </w:r>
           </w:p>
         </w:tc>
@@ -2946,7 +2946,7 @@
           <w:color w:val="2D3748"/>
           <w:sz w:val="22"/>
         </w:rPr>
-        <w:t>Revisá tu carpeta de spam o correo no deseado. Si tampoco está ahí, contactá al administrador del programa para que verifique el envío.</w:t>
+        <w:t>Revisa tu carpeta de spam o correo no deseado. Si tampoco está ahí, contacta al administrador del programa para que verifique el envío.</w:t>
       </w:r>
     </w:p>
     <w:p>
@@ -2967,7 +2967,7 @@
           <w:color w:val="2D3748"/>
           <w:sz w:val="22"/>
         </w:rPr>
-        <w:t>Los links de reset son válidos por 1 hora y solo se pueden usar una vez. Si expiró, solicitá otro desde "¿Olvidaste tu contraseña?" del login.</w:t>
+        <w:t>Los links de reset son válidos por 1 hora y solo se pueden usar una vez. Si expiró, solicita otro desde "¿Olvidaste tu contraseña?" del login.</w:t>
       </w:r>
     </w:p>
     <w:p>
@@ -2988,7 +2988,7 @@
           <w:color w:val="2D3748"/>
           <w:sz w:val="22"/>
         </w:rPr>
-        <w:t>Las evaluaciones se activan según el cronograma del programa. Si la fecha ya pasó y no la ves, contactá al administrador para que verifique el estado de activación.</w:t>
+        <w:t>Las evaluaciones se activan según el cronograma del programa. Si la fecha ya pasó y no la ves, contacta al administrador para que verifique el estado de activación.</w:t>
       </w:r>
     </w:p>
     <w:p>
@@ -3009,7 +3009,7 @@
           <w:color w:val="2D3748"/>
           <w:sz w:val="22"/>
         </w:rPr>
-        <w:t>Sí. Ve a Mis Evaluaciones → Encuestas Completadas y click en "Rehacer evaluación". Tus respuestas anteriores serán reemplazadas.</w:t>
+        <w:t>Sí. Ve a Mis Evaluaciones → Encuestas Completadas y haz click en "Rehacer evaluación". Tus respuestas anteriores serán reemplazadas.</w:t>
       </w:r>
     </w:p>
     <w:p>
@@ -3030,7 +3030,7 @@
           <w:color w:val="2D3748"/>
           <w:sz w:val="22"/>
         </w:rPr>
-        <w:t>Contactá al administrador del programa. Él puede verificar la asignación y corregirla si es necesario.</w:t>
+        <w:t>Contacta al administrador del programa. Él puede verificar la asignación y corregirla si es necesario.</w:t>
       </w:r>
     </w:p>
     <w:p>
@@ -3097,7 +3097,7 @@
           <w:color w:val="2D3748"/>
           <w:sz w:val="22"/>
         </w:rPr>
-        <w:t>Si necesitás ayuda o tenés alguna duda que no aparece en esta guía, contactá a:</w:t>
+        <w:t>Si necesitas ayuda o tienes alguna duda que no aparece en esta guía, contacta a:</w:t>
       </w:r>
     </w:p>
     <w:tbl>
@@ -3231,7 +3231,7 @@
                 <w:color w:val="2D3748"/>
                 <w:sz w:val="21"/>
               </w:rPr>
-              <w:t>Reportá dentro de la plataforma cualquier error técnico.</w:t>
+              <w:t>Reporta dentro de la plataforma cualquier error técnico.</w:t>
             </w:r>
           </w:p>
         </w:tc>

</xml_diff>